<commit_message>
Completa la procedencia en contratos de uva
</commit_message>
<xml_diff>
--- a/public/contract-templates/tonifruit-uva.docx
+++ b/public/contract-templates/tonifruit-uva.docx
@@ -1035,31 +1035,31 @@
           <w:sz w:val="20"/>
           <w:szCs w:val="20"/>
         </w:rPr>
-        <w:t xml:space="preserve">Código </w:t>
-      </w:r>
-      <w:r>
-        <w:rPr>
-          <w:rFonts w:ascii="Calibri" w:hAnsi="Calibri" w:cs="Arial"/>
-          <w:sz w:val="20"/>
-          <w:szCs w:val="20"/>
-        </w:rPr>
-        <w:t xml:space="preserve">operador ecológico: </w:t>
-      </w:r>
-      <w:r>
-        <w:rPr>
-          <w:rFonts w:ascii="Calibri" w:hAnsi="Calibri" w:cs="Arial"/>
-          <w:sz w:val="20"/>
-          <w:szCs w:val="20"/>
-        </w:rPr>
-        <w:t>MU-3078/E</w:t>
-      </w:r>
-      <w:r>
-        <w:rPr>
-          <w:rFonts w:ascii="Calibri" w:hAnsi="Calibri" w:cs="Arial"/>
-          <w:sz w:val="20"/>
-          <w:szCs w:val="20"/>
-        </w:rPr>
-        <w:t xml:space="preserve">                   </w:t>
+        <w:t xml:space="preserve"/>
+      </w:r>
+      <w:r>
+        <w:rPr>
+          <w:rFonts w:ascii="Calibri" w:hAnsi="Calibri" w:cs="Arial"/>
+          <w:sz w:val="20"/>
+          <w:szCs w:val="20"/>
+        </w:rPr>
+        <w:t xml:space="preserve"/>
+      </w:r>
+      <w:r>
+        <w:rPr>
+          <w:rFonts w:ascii="Calibri" w:hAnsi="Calibri" w:cs="Arial"/>
+          <w:sz w:val="20"/>
+          <w:szCs w:val="20"/>
+        </w:rPr>
+        <w:t/>
+      </w:r>
+      <w:r>
+        <w:rPr>
+          <w:rFonts w:ascii="Calibri" w:hAnsi="Calibri" w:cs="Arial"/>
+          <w:sz w:val="20"/>
+          <w:szCs w:val="20"/>
+        </w:rPr>
+        <w:t xml:space="preserve"/>
       </w:r>
     </w:p>
     <w:p>

</xml_diff>

<commit_message>
Limpia el modelo base de uva
</commit_message>
<xml_diff>
--- a/public/contract-templates/tonifruit-uva.docx
+++ b/public/contract-templates/tonifruit-uva.docx
@@ -1035,31 +1035,31 @@
           <w:sz w:val="20"/>
           <w:szCs w:val="20"/>
         </w:rPr>
-        <w:t xml:space="preserve">Código </w:t>
-      </w:r>
-      <w:r>
-        <w:rPr>
-          <w:rFonts w:ascii="Calibri" w:hAnsi="Calibri" w:cs="Arial"/>
-          <w:sz w:val="20"/>
-          <w:szCs w:val="20"/>
-        </w:rPr>
-        <w:t xml:space="preserve">operador ecológico: </w:t>
-      </w:r>
-      <w:r>
-        <w:rPr>
-          <w:rFonts w:ascii="Calibri" w:hAnsi="Calibri" w:cs="Arial"/>
-          <w:sz w:val="20"/>
-          <w:szCs w:val="20"/>
-        </w:rPr>
-        <w:t>MU-3078/E</w:t>
-      </w:r>
-      <w:r>
-        <w:rPr>
-          <w:rFonts w:ascii="Calibri" w:hAnsi="Calibri" w:cs="Arial"/>
-          <w:sz w:val="20"/>
-          <w:szCs w:val="20"/>
-        </w:rPr>
-        <w:t xml:space="preserve">                   </w:t>
+        <w:t xml:space="preserve"/>
+      </w:r>
+      <w:r>
+        <w:rPr>
+          <w:rFonts w:ascii="Calibri" w:hAnsi="Calibri" w:cs="Arial"/>
+          <w:sz w:val="20"/>
+          <w:szCs w:val="20"/>
+        </w:rPr>
+        <w:t xml:space="preserve"/>
+      </w:r>
+      <w:r>
+        <w:rPr>
+          <w:rFonts w:ascii="Calibri" w:hAnsi="Calibri" w:cs="Arial"/>
+          <w:sz w:val="20"/>
+          <w:szCs w:val="20"/>
+        </w:rPr>
+        <w:t/>
+      </w:r>
+      <w:r>
+        <w:rPr>
+          <w:rFonts w:ascii="Calibri" w:hAnsi="Calibri" w:cs="Arial"/>
+          <w:sz w:val="20"/>
+          <w:szCs w:val="20"/>
+        </w:rPr>
+        <w:t xml:space="preserve"/>
       </w:r>
     </w:p>
     <w:p>

</xml_diff>